<commit_message>
Mantém o bloco GenX / Goldman Sachs / lodo no pasto da Horse Jelly no MUP, adaptado para glifosato
Co-Authored-By: Claude Fable 5.1 <noreply@anthropic.com>
Claude-Session: https://claude.ai/code/session_017HYp1xhSzB6Ui5hyJvLbGE
</commit_message>
<xml_diff>
--- a/analise-ed/09_Provas_MUP_AlphaErec_HorseJelly.docx
+++ b/analise-ed/09_Provas_MUP_AlphaErec_HorseJelly.docx
@@ -2,7 +2,7 @@
 <file path=word/document.xml><?xml version="1.0" encoding="utf-8"?>
 <w:document xmlns:w="http://schemas.openxmlformats.org/wordprocessingml/2006/main" xmlns:m="http://schemas.openxmlformats.org/officeDocument/2006/math" xmlns:r="http://schemas.openxmlformats.org/officeDocument/2006/relationships" xmlns:o="urn:schemas-microsoft-com:office:office" xmlns:v="urn:schemas-microsoft-com:vml" xmlns:w10="urn:schemas-microsoft-com:office:word" xmlns:a="http://schemas.openxmlformats.org/drawingml/2006/main" xmlns:pic="http://schemas.openxmlformats.org/drawingml/2006/picture" xmlns:wp="http://schemas.openxmlformats.org/drawingml/2006/wordprocessingDrawing">
   <w:body>
-    <w:bookmarkStart w:id="29" w:name="X98f910aaaf2ee8bdc0b4f537d7a61bfc5ba06cf"/>
+    <w:bookmarkStart w:id="30" w:name="X98f910aaaf2ee8bdc0b4f537d7a61bfc5ba06cf"/>
     <w:p>
       <w:pPr>
         <w:pStyle w:val="Heading1"/>
@@ -1884,7 +1884,7 @@
       </w:r>
     </w:p>
     <w:bookmarkEnd w:id="25"/>
-    <w:bookmarkStart w:id="26" w:name="Xeee7da68f876f8faea6af71d09661dc4c1b7ee1"/>
+    <w:bookmarkStart w:id="27" w:name="Xeee7da68f876f8faea6af71d09661dc4c1b7ee1"/>
     <w:p>
       <w:pPr>
         <w:pStyle w:val="Heading2"/>
@@ -2453,7 +2453,643 @@
         <w:t xml:space="preserve">”</w:t>
       </w:r>
       <w:r>
-        <w:t xml:space="preserve">, carne vegetal, 10-K); HJ 17:59 → 19:24 (GenX, Goldman Sachs, lodo no pasto, caminhão que cobra duas vezes). Os dois desvios saem inteiros.</w:t>
+        <w:t xml:space="preserve">, carne vegetal, 10-K). Sai inteiro.</w:t>
+      </w:r>
+    </w:p>
+    <w:bookmarkStart w:id="26" w:name="Xd4ae0e9eddcf70e9d77972ba38ce89420f89a1c"/>
+    <w:p>
+      <w:pPr>
+        <w:pStyle w:val="Heading3"/>
+      </w:pPr>
+      <w:r>
+        <w:t xml:space="preserve">PL7-B — Mantido por decisão (10/10/2026): o bloco</w:t>
+      </w:r>
+      <w:r>
+        <w:t xml:space="preserve"> </w:t>
+      </w:r>
+      <w:r>
+        <w:t xml:space="preserve">“</w:t>
+      </w:r>
+      <w:r>
+        <w:t xml:space="preserve">GenX, Goldman Sachs e o lodo no pasto</w:t>
+      </w:r>
+      <w:r>
+        <w:t xml:space="preserve">”</w:t>
+      </w:r>
+      <w:r>
+        <w:t xml:space="preserve"> </w:t>
+      </w:r>
+      <w:r>
+        <w:t xml:space="preserve">(HJ 17:52 → 19:50)</w:t>
+      </w:r>
+    </w:p>
+    <w:p>
+      <w:pPr>
+        <w:pStyle w:val="FirstParagraph"/>
+      </w:pPr>
+      <w:r>
+        <w:t xml:space="preserve">É o bloco que fecha a tese do vilão com mecânica econômica e mata a objeção</w:t>
+      </w:r>
+      <w:r>
+        <w:t xml:space="preserve"> </w:t>
+      </w:r>
+      <w:r>
+        <w:t xml:space="preserve">“</w:t>
+      </w:r>
+      <w:r>
+        <w:t xml:space="preserve">então eu mudo a comida</w:t>
+      </w:r>
+      <w:r>
+        <w:t xml:space="preserve">”</w:t>
+      </w:r>
+      <w:r>
+        <w:t xml:space="preserve">. Entra depois do memo e antes do mecanismo do problema, adaptado de PFAS para glifosato em quatro movimentos:</w:t>
+      </w:r>
+    </w:p>
+    <w:p>
+      <w:pPr>
+        <w:pStyle w:val="BodyText"/>
+      </w:pPr>
+      <w:r>
+        <w:rPr>
+          <w:bCs/>
+          <w:b/>
+        </w:rPr>
+        <w:t xml:space="preserve">1. A troca de rótulo (HJ 17:59 → 18:14).</w:t>
+      </w:r>
+      <w:r>
+        <w:t xml:space="preserve"> </w:t>
+      </w:r>
+      <w:r>
+        <w:t xml:space="preserve">Frames: executivos analisando documento em frente à fábrica à noite; executivo e cientistas olhando documento no laboratório; lettering</w:t>
+      </w:r>
+      <w:r>
+        <w:t xml:space="preserve"> </w:t>
+      </w:r>
+      <w:r>
+        <w:t xml:space="preserve">“</w:t>
+      </w:r>
+      <w:r>
+        <w:t xml:space="preserve">SAME FAMILY</w:t>
+      </w:r>
+      <w:r>
+        <w:t xml:space="preserve">”</w:t>
+      </w:r>
+      <w:r>
+        <w:t xml:space="preserve">; monitor</w:t>
+      </w:r>
+      <w:r>
+        <w:t xml:space="preserve"> </w:t>
+      </w:r>
+      <w:r>
+        <w:t xml:space="preserve">“</w:t>
+      </w:r>
+      <w:r>
+        <w:t xml:space="preserve">PFAS FREE</w:t>
+      </w:r>
+      <w:r>
+        <w:t xml:space="preserve">”</w:t>
+      </w:r>
+      <w:r>
+        <w:t xml:space="preserve"> </w:t>
+      </w:r>
+      <w:r>
+        <w:t xml:space="preserve">com checkbox</w:t>
+      </w:r>
+      <w:r>
+        <w:t xml:space="preserve"> </w:t>
+      </w:r>
+      <w:r>
+        <w:t xml:space="preserve">“</w:t>
+      </w:r>
+      <w:r>
+        <w:t xml:space="preserve">Final Label Authorization</w:t>
+      </w:r>
+      <w:r>
+        <w:t xml:space="preserve">”</w:t>
+      </w:r>
+      <w:r>
+        <w:t xml:space="preserve">.</w:t>
+      </w:r>
+      <w:r>
+        <w:t xml:space="preserve"> </w:t>
+      </w:r>
+      <w:r>
+        <w:rPr>
+          <w:bCs/>
+          <w:b/>
+        </w:rPr>
+        <w:t xml:space="preserve">Adaptação real:</w:t>
+      </w:r>
+      <w:r>
+        <w:t xml:space="preserve"> </w:t>
+      </w:r>
+      <w:r>
+        <w:t xml:space="preserve">depois dos processos, a Bayer tirou o glifosato do Roundup de jardim vendido ao consumidor nos EUA (a partir de 2023) e manteve o Roundup agrícola. Lettering:</w:t>
+      </w:r>
+      <w:r>
+        <w:t xml:space="preserve"> </w:t>
+      </w:r>
+      <w:r>
+        <w:t xml:space="preserve">“</w:t>
+      </w:r>
+      <w:r>
+        <w:t xml:space="preserve">GLYPHOSATE-FREE</w:t>
+      </w:r>
+      <w:r>
+        <w:t xml:space="preserve">”</w:t>
+      </w:r>
+      <w:r>
+        <w:t xml:space="preserve"> </w:t>
+      </w:r>
+      <w:r>
+        <w:t xml:space="preserve">no frasco da prateleira →</w:t>
+      </w:r>
+      <w:r>
+        <w:t xml:space="preserve"> </w:t>
+      </w:r>
+      <w:r>
+        <w:t xml:space="preserve">“</w:t>
+      </w:r>
+      <w:r>
+        <w:t xml:space="preserve">a versão do seu jardim mudou; a versão do seu bife, não</w:t>
+      </w:r>
+      <w:r>
+        <w:t xml:space="preserve">”</w:t>
+      </w:r>
+      <w:r>
+        <w:t xml:space="preserve">. Monitor com</w:t>
+      </w:r>
+      <w:r>
+        <w:t xml:space="preserve"> </w:t>
+      </w:r>
+      <w:r>
+        <w:t xml:space="preserve">“</w:t>
+      </w:r>
+      <w:r>
+        <w:t xml:space="preserve">Final Label Authorization</w:t>
+      </w:r>
+      <w:r>
+        <w:t xml:space="preserve">”</w:t>
+      </w:r>
+      <w:r>
+        <w:t xml:space="preserve"> </w:t>
+      </w:r>
+      <w:r>
+        <w:t xml:space="preserve">igual ao da HJ.</w:t>
+      </w:r>
+    </w:p>
+    <w:p>
+      <w:pPr>
+        <w:pStyle w:val="BodyText"/>
+      </w:pPr>
+      <w:r>
+        <w:rPr>
+          <w:bCs/>
+          <w:b/>
+        </w:rPr>
+        <w:t xml:space="preserve">2. Cobrar duas vezes (HJ 18:26 → 18:58).</w:t>
+      </w:r>
+      <w:r>
+        <w:t xml:space="preserve"> </w:t>
+      </w:r>
+      <w:r>
+        <w:t xml:space="preserve">Frames: arranha-céu visto de baixo; trader na mesa de operações com telas; fichário</w:t>
+      </w:r>
+      <w:r>
+        <w:t xml:space="preserve"> </w:t>
+      </w:r>
+      <w:r>
+        <w:t xml:space="preserve">“</w:t>
+      </w:r>
+      <w:r>
+        <w:t xml:space="preserve">INVESTIGATIVE REPORT</w:t>
+      </w:r>
+      <w:r>
+        <w:t xml:space="preserve">”</w:t>
+      </w:r>
+      <w:r>
+        <w:t xml:space="preserve"> </w:t>
+      </w:r>
+      <w:r>
+        <w:t xml:space="preserve">com mapa dos EUA e</w:t>
+      </w:r>
+      <w:r>
+        <w:t xml:space="preserve"> </w:t>
+      </w:r>
+      <w:r>
+        <w:t xml:space="preserve">“</w:t>
+      </w:r>
+      <w:r>
+        <w:t xml:space="preserve">US$ 1.7 billion</w:t>
+      </w:r>
+      <w:r>
+        <w:t xml:space="preserve">”</w:t>
+      </w:r>
+      <w:r>
+        <w:t xml:space="preserve">; fazendeiro de boné com tablet e mapa de talhões; mangueira sugando bueiro; caminhão-tanque na estrada de terra; cano despejando lodo na plantação; lettering</w:t>
+      </w:r>
+      <w:r>
+        <w:t xml:space="preserve"> </w:t>
+      </w:r>
+      <w:r>
+        <w:t xml:space="preserve">“</w:t>
+      </w:r>
+      <w:r>
+        <w:t xml:space="preserve">the same truck charging twice</w:t>
+      </w:r>
+      <w:r>
+        <w:t xml:space="preserve">”</w:t>
+      </w:r>
+      <w:r>
+        <w:t xml:space="preserve">.</w:t>
+      </w:r>
+      <w:r>
+        <w:t xml:space="preserve"> </w:t>
+      </w:r>
+      <w:r>
+        <w:rPr>
+          <w:bCs/>
+          <w:b/>
+        </w:rPr>
+        <w:t xml:space="preserve">Adaptação real:</w:t>
+      </w:r>
+      <w:r>
+        <w:t xml:space="preserve"> </w:t>
+      </w:r>
+      <w:r>
+        <w:t xml:space="preserve">a mesma empresa vende a semente feita para sobreviver ao veneno (Roundup Ready) e o veneno.</w:t>
+      </w:r>
+      <w:r>
+        <w:t xml:space="preserve"> </w:t>
+      </w:r>
+      <w:r>
+        <w:t xml:space="preserve">“</w:t>
+      </w:r>
+      <w:r>
+        <w:t xml:space="preserve">O mesmo caminhão cobra duas vezes: a semente que aguenta o spray, e o spray.</w:t>
+      </w:r>
+      <w:r>
+        <w:t xml:space="preserve">”</w:t>
+      </w:r>
+      <w:r>
+        <w:t xml:space="preserve"> </w:t>
+      </w:r>
+      <w:r>
+        <w:t xml:space="preserve">Frames: saco de semente com o selo</w:t>
+      </w:r>
+      <w:r>
+        <w:t xml:space="preserve"> </w:t>
+      </w:r>
+      <w:r>
+        <w:t xml:space="preserve">“</w:t>
+      </w:r>
+      <w:r>
+        <w:t xml:space="preserve">Roundup Ready</w:t>
+      </w:r>
+      <w:r>
+        <w:t xml:space="preserve">”</w:t>
+      </w:r>
+      <w:r>
+        <w:t xml:space="preserve"> </w:t>
+      </w:r>
+      <w:r>
+        <w:t xml:space="preserve">ao lado do galão; o mapa de talhões no tablet do fazendeiro; a nota fiscal com as duas linhas marcadas em amarelo. O trader e o fichário de fundo ficam para</w:t>
+      </w:r>
+      <w:r>
+        <w:t xml:space="preserve"> </w:t>
+      </w:r>
+      <w:r>
+        <w:t xml:space="preserve">“</w:t>
+      </w:r>
+      <w:r>
+        <w:t xml:space="preserve">quem financia a fazenda</w:t>
+      </w:r>
+      <w:r>
+        <w:t xml:space="preserve">”</w:t>
+      </w:r>
+      <w:r>
+        <w:t xml:space="preserve">: fundos de Wall Street donos de terra agrícola (manter o frame do fichário com</w:t>
+      </w:r>
+      <w:r>
+        <w:t xml:space="preserve"> </w:t>
+      </w:r>
+      <w:r>
+        <w:t xml:space="preserve">“</w:t>
+      </w:r>
+      <w:r>
+        <w:t xml:space="preserve">US$ X billion</w:t>
+      </w:r>
+      <w:r>
+        <w:t xml:space="preserve">”</w:t>
+      </w:r>
+      <w:r>
+        <w:t xml:space="preserve"> </w:t>
+      </w:r>
+      <w:r>
+        <w:t xml:space="preserve">e o lettering</w:t>
+      </w:r>
+      <w:r>
+        <w:t xml:space="preserve"> </w:t>
+      </w:r>
+      <w:r>
+        <w:t xml:space="preserve">“</w:t>
+      </w:r>
+      <w:r>
+        <w:t xml:space="preserve">IT’S NOT THEORY</w:t>
+      </w:r>
+      <w:r>
+        <w:t xml:space="preserve">”</w:t>
+      </w:r>
+      <w:r>
+        <w:t xml:space="preserve"> </w:t>
+      </w:r>
+      <w:r>
+        <w:t xml:space="preserve">de HJ 19:02).</w:t>
+      </w:r>
+    </w:p>
+    <w:p>
+      <w:pPr>
+        <w:pStyle w:val="BodyText"/>
+      </w:pPr>
+      <w:r>
+        <w:rPr>
+          <w:bCs/>
+          <w:b/>
+        </w:rPr>
+        <w:t xml:space="preserve">3. O lodo no pasto do seu bife (HJ 18:51 → 19:24).</w:t>
+      </w:r>
+      <w:r>
+        <w:t xml:space="preserve"> </w:t>
+      </w:r>
+      <w:r>
+        <w:t xml:space="preserve">Frames: mangueira no bueiro; caminhão-tanque; cano despejando lodo escuro; pasta</w:t>
+      </w:r>
+      <w:r>
+        <w:t xml:space="preserve"> </w:t>
+      </w:r>
+      <w:r>
+        <w:t xml:space="preserve">“</w:t>
+      </w:r>
+      <w:r>
+        <w:t xml:space="preserve">Q3 2024 INVESTMENT FUND PORTFOLIO ANALYSIS – CONFIDENTIAL</w:t>
+      </w:r>
+      <w:r>
+        <w:t xml:space="preserve">”</w:t>
+      </w:r>
+      <w:r>
+        <w:t xml:space="preserve">; linha de produção</w:t>
+      </w:r>
+      <w:r>
+        <w:t xml:space="preserve"> </w:t>
+      </w:r>
+      <w:r>
+        <w:t xml:space="preserve">“</w:t>
+      </w:r>
+      <w:r>
+        <w:t xml:space="preserve">3M POISONING FOR 28 YEARS</w:t>
+      </w:r>
+      <w:r>
+        <w:t xml:space="preserve">”</w:t>
+      </w:r>
+      <w:r>
+        <w:t xml:space="preserve">; mão assinando documento com lettering</w:t>
+      </w:r>
+      <w:r>
+        <w:t xml:space="preserve"> </w:t>
+      </w:r>
+      <w:r>
+        <w:t xml:space="preserve">“</w:t>
+      </w:r>
+      <w:r>
+        <w:t xml:space="preserve">ON THE PASTURE OF YOUR STEAK</w:t>
+      </w:r>
+      <w:r>
+        <w:t xml:space="preserve">”</w:t>
+      </w:r>
+      <w:r>
+        <w:t xml:space="preserve">.</w:t>
+      </w:r>
+      <w:r>
+        <w:t xml:space="preserve"> </w:t>
+      </w:r>
+      <w:r>
+        <w:rPr>
+          <w:bCs/>
+          <w:b/>
+        </w:rPr>
+        <w:t xml:space="preserve">Adaptação com fato real e texano:</w:t>
+      </w:r>
+      <w:r>
+        <w:t xml:space="preserve"> </w:t>
+      </w:r>
+      <w:r>
+        <w:t xml:space="preserve">o lodo de esgoto das cidades é espalhado como adubo em pasto (biossólidos), e em 2024 rancheiros do condado de Johnson, Texas, processaram a prefeitura e a empresa de biossólidos por gado morto e pasto contaminado. É o segundo veneno no mesmo prato:</w:t>
+      </w:r>
+      <w:r>
+        <w:t xml:space="preserve"> </w:t>
+      </w:r>
+      <w:r>
+        <w:t xml:space="preserve">“</w:t>
+      </w:r>
+      <w:r>
+        <w:t xml:space="preserve">a prefeitura paga pra levar o esgoto; o rancho recebe pra espalhar no pasto; o caminhão cobra duas vezes; o seu bife come os dois</w:t>
+      </w:r>
+      <w:r>
+        <w:t xml:space="preserve">”</w:t>
+      </w:r>
+      <w:r>
+        <w:t xml:space="preserve">. Manter os frames do bueiro, do caminhão e do cano; trocar</w:t>
+      </w:r>
+      <w:r>
+        <w:t xml:space="preserve"> </w:t>
+      </w:r>
+      <w:r>
+        <w:t xml:space="preserve">“</w:t>
+      </w:r>
+      <w:r>
+        <w:t xml:space="preserve">3M</w:t>
+      </w:r>
+      <w:r>
+        <w:t xml:space="preserve">”</w:t>
+      </w:r>
+      <w:r>
+        <w:t xml:space="preserve"> </w:t>
+      </w:r>
+      <w:r>
+        <w:t xml:space="preserve">por</w:t>
+      </w:r>
+      <w:r>
+        <w:t xml:space="preserve"> </w:t>
+      </w:r>
+      <w:r>
+        <w:t xml:space="preserve">“</w:t>
+      </w:r>
+      <w:r>
+        <w:t xml:space="preserve">BAYER — 50 YEARS</w:t>
+      </w:r>
+      <w:r>
+        <w:t xml:space="preserve">”</w:t>
+      </w:r>
+      <w:r>
+        <w:t xml:space="preserve">; a mão assinando documento vira a assinatura do contrato de biossólidos com o condado. Lettering:</w:t>
+      </w:r>
+      <w:r>
+        <w:t xml:space="preserve"> </w:t>
+      </w:r>
+      <w:r>
+        <w:t xml:space="preserve">“</w:t>
+      </w:r>
+      <w:r>
+        <w:t xml:space="preserve">ON THE PASTURE OF YOUR STEAK — JOHNSON COUNTY, TX</w:t>
+      </w:r>
+      <w:r>
+        <w:t xml:space="preserve">”</w:t>
+      </w:r>
+      <w:r>
+        <w:t xml:space="preserve">.</w:t>
+      </w:r>
+    </w:p>
+    <w:p>
+      <w:pPr>
+        <w:pStyle w:val="BodyText"/>
+      </w:pPr>
+      <w:r>
+        <w:rPr>
+          <w:bCs/>
+          <w:b/>
+        </w:rPr>
+        <w:t xml:space="preserve">4. Não existe filtro pra chuva (HJ 19:38 → 19:42).</w:t>
+      </w:r>
+      <w:r>
+        <w:t xml:space="preserve"> </w:t>
+      </w:r>
+      <w:r>
+        <w:t xml:space="preserve">Frames: pesquisadores de parka vermelha coletando amostra na neve, etiqueta</w:t>
+      </w:r>
+      <w:r>
+        <w:t xml:space="preserve"> </w:t>
+      </w:r>
+      <w:r>
+        <w:t xml:space="preserve">“</w:t>
+      </w:r>
+      <w:r>
+        <w:t xml:space="preserve">Antarctica</w:t>
+      </w:r>
+      <w:r>
+        <w:t xml:space="preserve">”</w:t>
+      </w:r>
+      <w:r>
+        <w:t xml:space="preserve">; prato de café da manhã (ovos, salsicha, hash brown) e suco; lettering</w:t>
+      </w:r>
+      <w:r>
+        <w:t xml:space="preserve"> </w:t>
+      </w:r>
+      <w:r>
+        <w:t xml:space="preserve">“</w:t>
+      </w:r>
+      <w:r>
+        <w:t xml:space="preserve">you can change the food</w:t>
+      </w:r>
+      <w:r>
+        <w:t xml:space="preserve">”</w:t>
+      </w:r>
+      <w:r>
+        <w:t xml:space="preserve">.</w:t>
+      </w:r>
+      <w:r>
+        <w:t xml:space="preserve"> </w:t>
+      </w:r>
+      <w:r>
+        <w:rPr>
+          <w:bCs/>
+          <w:b/>
+        </w:rPr>
+        <w:t xml:space="preserve">Adaptação real:</w:t>
+      </w:r>
+      <w:r>
+        <w:t xml:space="preserve"> </w:t>
+      </w:r>
+      <w:r>
+        <w:t xml:space="preserve">o USGS encontrou glifosato no ar e na água da chuva do Mississippi e de Iowa (60 a 100% das amostras). Trocar a Antártida pela chuva caindo num pasto do Texas e pelo coletor de chuva com etiqueta</w:t>
+      </w:r>
+      <w:r>
+        <w:t xml:space="preserve"> </w:t>
+      </w:r>
+      <w:r>
+        <w:t xml:space="preserve">“</w:t>
+      </w:r>
+      <w:r>
+        <w:t xml:space="preserve">USGS — Rain Sample</w:t>
+      </w:r>
+      <w:r>
+        <w:t xml:space="preserve">”</w:t>
+      </w:r>
+      <w:r>
+        <w:t xml:space="preserve">. Fala mantida:</w:t>
+      </w:r>
+      <w:r>
+        <w:t xml:space="preserve"> </w:t>
+      </w:r>
+      <w:r>
+        <w:t xml:space="preserve">“</w:t>
+      </w:r>
+      <w:r>
+        <w:t xml:space="preserve">você pode trocar a comida, a panela, o filtro da torneira, mas não existe filtro que resolva a chuva</w:t>
+      </w:r>
+      <w:r>
+        <w:t xml:space="preserve">”</w:t>
+      </w:r>
+      <w:r>
+        <w:t xml:space="preserve">. É o que torna o verbo PROTEGER obrigatório no MUS.</w:t>
+      </w:r>
+    </w:p>
+    <w:p>
+      <w:pPr>
+        <w:pStyle w:val="BodyText"/>
+      </w:pPr>
+      <w:r>
+        <w:rPr>
+          <w:bCs/>
+          <w:b/>
+        </w:rPr>
+        <w:t xml:space="preserve">Fechamento do bloco (HJ 19:42):</w:t>
+      </w:r>
+      <w:r>
+        <w:t xml:space="preserve"> </w:t>
+      </w:r>
+      <w:r>
+        <w:t xml:space="preserve">“</w:t>
+      </w:r>
+      <w:r>
+        <w:t xml:space="preserve">3 corporações coordenadas faturando US$ 32 bilhões por ano com o seu pau não levantando.</w:t>
+      </w:r>
+      <w:r>
+        <w:t xml:space="preserve">”</w:t>
+      </w:r>
+      <w:r>
+        <w:t xml:space="preserve"> </w:t>
+      </w:r>
+      <w:r>
+        <w:t xml:space="preserve">Ficar com o número e com o prato de café da manhã como última imagem antes do mecanismo.</w:t>
+      </w:r>
+    </w:p>
+    <w:p>
+      <w:pPr>
+        <w:pStyle w:val="BodyText"/>
+      </w:pPr>
+      <w:r>
+        <w:rPr>
+          <w:bCs/>
+          <w:b/>
+        </w:rPr>
+        <w:t xml:space="preserve">Não levar deste bloco:</w:t>
+      </w:r>
+      <w:r>
+        <w:t xml:space="preserve"> </w:t>
+      </w:r>
+      <w:r>
+        <w:t xml:space="preserve">nada; cortar apenas repetições de caminhão (um frame de cada basta).</w:t>
       </w:r>
     </w:p>
     <w:p>
@@ -2464,7 +3100,8 @@
       </w:r>
     </w:p>
     <w:bookmarkEnd w:id="26"/>
-    <w:bookmarkStart w:id="27" w:name="X3517daff4cf52e5d25d99d7ccb9ee62c73b95c9"/>
+    <w:bookmarkEnd w:id="27"/>
+    <w:bookmarkStart w:id="28" w:name="X3517daff4cf52e5d25d99d7ccb9ee62c73b95c9"/>
     <w:p>
       <w:pPr>
         <w:pStyle w:val="Heading2"/>
@@ -3004,8 +3641,8 @@
         </w:tc>
       </w:tr>
     </w:tbl>
-    <w:bookmarkEnd w:id="27"/>
-    <w:bookmarkStart w:id="28" w:name="Xe4ad421b777ab19e3ddadba4d4c67b2ee7cf118"/>
+    <w:bookmarkEnd w:id="28"/>
+    <w:bookmarkStart w:id="29" w:name="Xe4ad421b777ab19e3ddadba4d4c67b2ee7cf118"/>
     <w:p>
       <w:pPr>
         <w:pStyle w:val="Heading2"/>
@@ -3636,9 +4273,101 @@
           </w:p>
         </w:tc>
       </w:tr>
+      <w:tr>
+        <w:tc>
+          <w:tcPr/>
+          <w:p>
+            <w:pPr>
+              <w:pStyle w:val="Compact"/>
+              <w:jc w:val="left"/>
+            </w:pPr>
+            <w:r>
+              <w:t xml:space="preserve">PL7-B</w:t>
+            </w:r>
+          </w:p>
+        </w:tc>
+        <w:tc>
+          <w:tcPr/>
+          <w:p>
+            <w:pPr>
+              <w:pStyle w:val="Compact"/>
+              <w:jc w:val="left"/>
+            </w:pPr>
+            <w:r>
+              <w:t xml:space="preserve">HJ 19:07 pasta do fundo · contrato de biossólidos (Johnson County, TX)</w:t>
+            </w:r>
+          </w:p>
+        </w:tc>
+        <w:tc>
+          <w:tcPr/>
+          <w:p>
+            <w:pPr>
+              <w:pStyle w:val="Compact"/>
+              <w:jc w:val="left"/>
+            </w:pPr>
+            <w:r>
+              <w:t xml:space="preserve">$1,7 bi · $32 bi/ano · 60–100% da chuva</w:t>
+            </w:r>
+          </w:p>
+        </w:tc>
+        <w:tc>
+          <w:tcPr/>
+          <w:p>
+            <w:pPr>
+              <w:pStyle w:val="Compact"/>
+              <w:jc w:val="left"/>
+            </w:pPr>
+            <w:r>
+              <w:t xml:space="preserve">“</w:t>
+            </w:r>
+            <w:r>
+              <w:t xml:space="preserve">o caminhão cobra duas vezes</w:t>
+            </w:r>
+            <w:r>
+              <w:t xml:space="preserve">”</w:t>
+            </w:r>
+          </w:p>
+        </w:tc>
+        <w:tc>
+          <w:tcPr/>
+          <w:p>
+            <w:pPr>
+              <w:pStyle w:val="Compact"/>
+              <w:jc w:val="left"/>
+            </w:pPr>
+            <w:r>
+              <w:t xml:space="preserve">HJ 18:58 cano despejando lodo · chuva no pasto</w:t>
+            </w:r>
+          </w:p>
+        </w:tc>
+        <w:tc>
+          <w:tcPr/>
+          <w:p>
+            <w:pPr>
+              <w:pStyle w:val="Compact"/>
+              <w:jc w:val="left"/>
+            </w:pPr>
+            <w:r>
+              <w:t xml:space="preserve">HJ 18:14 monitor</w:t>
+            </w:r>
+            <w:r>
+              <w:t xml:space="preserve"> </w:t>
+            </w:r>
+            <w:r>
+              <w:t xml:space="preserve">“</w:t>
+            </w:r>
+            <w:r>
+              <w:t xml:space="preserve">Final Label Authorization</w:t>
+            </w:r>
+            <w:r>
+              <w:t xml:space="preserve">”</w:t>
+            </w:r>
+          </w:p>
+        </w:tc>
+      </w:tr>
     </w:tbl>
-    <w:bookmarkEnd w:id="28"/>
     <w:bookmarkEnd w:id="29"/>
+    <w:bookmarkEnd w:id="30"/>
     <w:sectPr/>
   </w:body>
 </w:document>

</xml_diff>